<commit_message>
Ajout du TP JAVA 02 en format docx
</commit_message>
<xml_diff>
--- a/Sujets TP/TP JAVA - 02 - Liste de scores.docx
+++ b/Sujets TP/TP JAVA - 02 - Liste de scores.docx
@@ -65,8 +65,6 @@
           </wp:inline>
         </w:drawing>
       </w:r>
-      <w:bookmarkStart w:id="0" w:name="_GoBack"/>
-      <w:bookmarkEnd w:id="0"/>
     </w:p>
     <w:p>
       <w:pPr>
@@ -112,6 +110,8 @@
         </w:rPr>
         <w:t>1)  Implémentez les codes sources suivants :</w:t>
       </w:r>
+      <w:bookmarkStart w:id="0" w:name="_GoBack"/>
+      <w:bookmarkEnd w:id="0"/>
     </w:p>
     <w:p>
       <w:pPr>
@@ -514,15 +514,7 @@
           <w:sz w:val="18"/>
           <w:szCs w:val="18"/>
         </w:rPr>
-        <w:t xml:space="preserve"> 11        </w:t>
-      </w:r>
-      <w:r>
-        <w:rPr>
-          <w:rFonts w:ascii="Courier New" w:eastAsia="Courier New" w:hAnsi="Courier New" w:cs="Courier New"/>
-          <w:sz w:val="18"/>
-          <w:szCs w:val="18"/>
-        </w:rPr>
-        <w:t xml:space="preserve">   </w:t>
+        <w:t xml:space="preserve"> 11           </w:t>
       </w:r>
       <w:proofErr w:type="spellStart"/>
       <w:r>
@@ -784,16 +776,7 @@
           <w:szCs w:val="18"/>
           <w:lang w:val="en-GB"/>
         </w:rPr>
-        <w:t xml:space="preserve"> 16      </w:t>
-      </w:r>
-      <w:r>
-        <w:rPr>
-          <w:rFonts w:ascii="Courier New" w:eastAsia="Courier New" w:hAnsi="Courier New" w:cs="Courier New"/>
-          <w:sz w:val="18"/>
-          <w:szCs w:val="18"/>
-          <w:lang w:val="en-GB"/>
-        </w:rPr>
-        <w:t xml:space="preserve">     // </w:t>
+        <w:t xml:space="preserve"> 16           // </w:t>
       </w:r>
       <w:proofErr w:type="gramStart"/>
       <w:r>
@@ -1577,6 +1560,9 @@
     <w:p>
       <w:pPr>
         <w:ind w:left="360"/>
+        <w:rPr>
+          <w:lang w:val="en-GB"/>
+        </w:rPr>
       </w:pPr>
       <w:r>
         <w:rPr>
@@ -1743,6 +1729,7 @@
           <w:rFonts w:ascii="Courier New" w:eastAsia="Courier New" w:hAnsi="Courier New" w:cs="Courier New"/>
           <w:sz w:val="18"/>
           <w:szCs w:val="18"/>
+          <w:lang w:val="en-GB"/>
         </w:rPr>
         <w:t>##--")</w:t>
       </w:r>
@@ -1756,8 +1743,17 @@
           <w:rFonts w:ascii="Courier New" w:eastAsia="Courier New" w:hAnsi="Courier New" w:cs="Courier New"/>
           <w:sz w:val="18"/>
           <w:szCs w:val="18"/>
-        </w:rPr>
-        <w:t xml:space="preserve"> 17       }</w:t>
+          <w:lang w:val="en-GB"/>
+        </w:rPr>
+        <w:t xml:space="preserve"> </w:t>
+      </w:r>
+      <w:r>
+        <w:rPr>
+          <w:rFonts w:ascii="Courier New" w:eastAsia="Courier New" w:hAnsi="Courier New" w:cs="Courier New"/>
+          <w:sz w:val="18"/>
+          <w:szCs w:val="18"/>
+        </w:rPr>
+        <w:t>17       }</w:t>
       </w:r>
     </w:p>
     <w:p>
@@ -1829,28 +1825,7 @@
           <w:sz w:val="18"/>
           <w:szCs w:val="18"/>
         </w:rPr>
-        <w:t xml:space="preserve"> 19           // TODO :</w:t>
-      </w:r>
-      <w:r>
-        <w:rPr>
-          <w:rFonts w:ascii="Courier New" w:eastAsia="Courier New" w:hAnsi="Courier New" w:cs="Courier New"/>
-          <w:sz w:val="18"/>
-          <w:szCs w:val="18"/>
-        </w:rPr>
-        <w:t xml:space="preserve"> Implémenter pour calculer la moyenne</w:t>
-      </w:r>
-    </w:p>
-    <w:p>
-      <w:pPr>
-        <w:ind w:left="360"/>
-      </w:pPr>
-      <w:r>
-        <w:rPr>
-          <w:rFonts w:ascii="Courier New" w:eastAsia="Courier New" w:hAnsi="Courier New" w:cs="Courier New"/>
-          <w:sz w:val="18"/>
-          <w:szCs w:val="18"/>
-        </w:rPr>
-        <w:t xml:space="preserve"> 20           return 0;</w:t>
+        <w:t xml:space="preserve"> 19           // TODO : Implémenter pour calculer la moyenne</w:t>
       </w:r>
     </w:p>
     <w:p>
@@ -1875,6 +1850,32 @@
           <w:szCs w:val="18"/>
           <w:lang w:val="en-GB"/>
         </w:rPr>
+        <w:t>20           return 0;</w:t>
+      </w:r>
+    </w:p>
+    <w:p>
+      <w:pPr>
+        <w:ind w:left="360"/>
+        <w:rPr>
+          <w:lang w:val="en-GB"/>
+        </w:rPr>
+      </w:pPr>
+      <w:r>
+        <w:rPr>
+          <w:rFonts w:ascii="Courier New" w:eastAsia="Courier New" w:hAnsi="Courier New" w:cs="Courier New"/>
+          <w:sz w:val="18"/>
+          <w:szCs w:val="18"/>
+          <w:lang w:val="en-GB"/>
+        </w:rPr>
+        <w:t xml:space="preserve"> </w:t>
+      </w:r>
+      <w:r>
+        <w:rPr>
+          <w:rFonts w:ascii="Courier New" w:eastAsia="Courier New" w:hAnsi="Courier New" w:cs="Courier New"/>
+          <w:sz w:val="18"/>
+          <w:szCs w:val="18"/>
+          <w:lang w:val="en-GB"/>
+        </w:rPr>
         <w:t>21       }</w:t>
       </w:r>
     </w:p>
@@ -2128,16 +2129,7 @@
           <w:szCs w:val="18"/>
           <w:lang w:val="en-GB"/>
         </w:rPr>
-        <w:t xml:space="preserve"> 27 </w:t>
-      </w:r>
-      <w:r>
-        <w:rPr>
-          <w:rFonts w:ascii="Courier New" w:eastAsia="Courier New" w:hAnsi="Courier New" w:cs="Courier New"/>
-          <w:sz w:val="18"/>
-          <w:szCs w:val="18"/>
-          <w:lang w:val="en-GB"/>
-        </w:rPr>
-        <w:t xml:space="preserve">          return </w:t>
+        <w:t xml:space="preserve"> 27           return </w:t>
       </w:r>
       <w:proofErr w:type="spellStart"/>
       <w:r>
@@ -2248,6 +2240,9 @@
     <w:p>
       <w:pPr>
         <w:ind w:left="360"/>
+        <w:rPr>
+          <w:lang w:val="en-GB"/>
+        </w:rPr>
       </w:pPr>
       <w:r>
         <w:rPr>
@@ -2263,6 +2258,7 @@
           <w:rFonts w:ascii="Courier New" w:eastAsia="Courier New" w:hAnsi="Courier New" w:cs="Courier New"/>
           <w:sz w:val="18"/>
           <w:szCs w:val="18"/>
+          <w:lang w:val="en-GB"/>
         </w:rPr>
         <w:t xml:space="preserve">30           return </w:t>
       </w:r>
@@ -2272,6 +2268,7 @@
           <w:rFonts w:ascii="Courier New" w:eastAsia="Courier New" w:hAnsi="Courier New" w:cs="Courier New"/>
           <w:sz w:val="18"/>
           <w:szCs w:val="18"/>
+          <w:lang w:val="en-GB"/>
         </w:rPr>
         <w:t>this.n</w:t>
       </w:r>
@@ -2281,6 +2278,7 @@
           <w:rFonts w:ascii="Courier New" w:eastAsia="Courier New" w:hAnsi="Courier New" w:cs="Courier New"/>
           <w:sz w:val="18"/>
           <w:szCs w:val="18"/>
+          <w:lang w:val="en-GB"/>
         </w:rPr>
         <w:t>;</w:t>
       </w:r>
@@ -2294,8 +2292,17 @@
           <w:rFonts w:ascii="Courier New" w:eastAsia="Courier New" w:hAnsi="Courier New" w:cs="Courier New"/>
           <w:sz w:val="18"/>
           <w:szCs w:val="18"/>
-        </w:rPr>
-        <w:t xml:space="preserve"> 31       }</w:t>
+          <w:lang w:val="en-GB"/>
+        </w:rPr>
+        <w:t xml:space="preserve"> </w:t>
+      </w:r>
+      <w:r>
+        <w:rPr>
+          <w:rFonts w:ascii="Courier New" w:eastAsia="Courier New" w:hAnsi="Courier New" w:cs="Courier New"/>
+          <w:sz w:val="18"/>
+          <w:szCs w:val="18"/>
+        </w:rPr>
+        <w:t>31       }</w:t>
       </w:r>
     </w:p>
     <w:p>
@@ -2461,52 +2468,39 @@
           <w:sz w:val="22"/>
           <w:szCs w:val="22"/>
         </w:rPr>
-        <w:t xml:space="preserve">4)  Faire les </w:t>
-      </w:r>
+        <w:t>4)  Faire les TODO dans les fichiers.</w:t>
+      </w:r>
+    </w:p>
+    <w:p>
+      <w:pPr>
+        <w:spacing w:after="100"/>
+      </w:pPr>
       <w:r>
         <w:rPr>
           <w:rFonts w:ascii="Arial" w:eastAsia="Arial" w:hAnsi="Arial" w:cs="Arial"/>
           <w:sz w:val="22"/>
           <w:szCs w:val="22"/>
         </w:rPr>
-        <w:t>TODO dans les fichiers.</w:t>
-      </w:r>
-    </w:p>
-    <w:p>
-      <w:pPr>
-        <w:spacing w:after="100"/>
-      </w:pPr>
+        <w:t xml:space="preserve">5)  Dans la classe </w:t>
+      </w:r>
+      <w:proofErr w:type="spellStart"/>
       <w:r>
         <w:rPr>
           <w:rFonts w:ascii="Arial" w:eastAsia="Arial" w:hAnsi="Arial" w:cs="Arial"/>
           <w:sz w:val="22"/>
           <w:szCs w:val="22"/>
         </w:rPr>
-        <w:t xml:space="preserve">5)  Dans la classe </w:t>
-      </w:r>
-      <w:proofErr w:type="spellStart"/>
+        <w:t>ScoresList</w:t>
+      </w:r>
+      <w:proofErr w:type="spellEnd"/>
       <w:r>
         <w:rPr>
           <w:rFonts w:ascii="Arial" w:eastAsia="Arial" w:hAnsi="Arial" w:cs="Arial"/>
           <w:sz w:val="22"/>
           <w:szCs w:val="22"/>
         </w:rPr>
-        <w:t>ScoresList</w:t>
-      </w:r>
-      <w:proofErr w:type="spellEnd"/>
-      <w:r>
-        <w:rPr>
-          <w:rFonts w:ascii="Arial" w:eastAsia="Arial" w:hAnsi="Arial" w:cs="Arial"/>
-          <w:sz w:val="22"/>
-          <w:szCs w:val="22"/>
-        </w:rPr>
         <w:t>,  commenter avant chaque méthode ce qu’elle fait.</w:t>
       </w:r>
-    </w:p>
-    <w:p>
-      <w:pPr>
-        <w:spacing w:after="120"/>
-      </w:pPr>
     </w:p>
     <w:p>
       <w:r>
@@ -3779,7 +3773,7 @@
 </file>
 
 <file path=customXml/itemProps1.xml><?xml version="1.0" encoding="utf-8"?>
-<ds:datastoreItem xmlns:ds="http://schemas.openxmlformats.org/officeDocument/2006/customXml" ds:itemID="{DF336CD6-4CE6-46DC-9C08-388FF76195F6}">
+<ds:datastoreItem xmlns:ds="http://schemas.openxmlformats.org/officeDocument/2006/customXml" ds:itemID="{CE10659B-EF37-4D27-B1AA-E7814B49C415}">
   <ds:schemaRefs>
     <ds:schemaRef ds:uri="http://schemas.openxmlformats.org/officeDocument/2006/bibliography"/>
   </ds:schemaRefs>

</xml_diff>